<commit_message>
docs(docs): pasar el SQAP v1.1, el SAD y el SRS al Word y al PDF
SQAP v1.1 (ADR-0008 y ADR-0009): desarrollo directo en develop, revisión
de commits, web en Render; Figura 4 redibujada para el flujo en develop.
SAD 1.1: Figura 1 sin Vercel, módulos de dimensiones y asistencia.
SRS 1.1: Sección 2.3 con las decisiones D1 a D9.

Refs: T-002
</commit_message>
<xml_diff>
--- a/docs/sad/SAD-CalisFacu.docx
+++ b/docs/sad/SAD-CalisFacu.docx
@@ -37,7 +37,7 @@
           <w:color w:val="767171"/>
           <w:sz w:val="24"/>
         </w:rPr>
-        <w:t>Equipo L-001 · COM450 Calidad de Software · Gestión II/2026 · Versión 1.0</w:t>
+        <w:t>Equipo L-001 · COM450 Calidad de Software · Gestión II/2026 · Versión 1.1</w:t>
       </w:r>
     </w:p>
     <w:p>
@@ -91,7 +91,7 @@
       <w:r>
         <w:drawing>
           <wp:inline xmlns:a="http://schemas.openxmlformats.org/drawingml/2006/main" xmlns:pic="http://schemas.openxmlformats.org/drawingml/2006/picture">
-            <wp:extent cx="6309360" cy="1794627"/>
+            <wp:extent cx="6309360" cy="2816678"/>
             <wp:docPr id="1" name="Picture 1"/>
             <wp:cNvGraphicFramePr>
               <a:graphicFrameLocks noChangeAspect="1"/>
@@ -112,7 +112,7 @@
                   <pic:spPr>
                     <a:xfrm>
                       <a:off x="0" y="0"/>
-                      <a:ext cx="6309360" cy="1794627"/>
+                      <a:ext cx="6309360" cy="2816678"/>
                     </a:xfrm>
                     <a:prstGeom prst="rect"/>
                   </pic:spPr>
@@ -292,7 +292,7 @@
               <w:rPr>
                 <w:sz w:val="19"/>
               </w:rPr>
-              <w:t>React + Vite + TypeScript, en Vercel</w:t>
+              <w:t>React + Vite + TypeScript, en Render</w:t>
             </w:r>
           </w:p>
         </w:tc>
@@ -994,7 +994,7 @@
           <w:rFonts w:ascii="Consolas" w:hAnsi="Consolas" w:cs="Consolas" w:eastAsia="Consolas"/>
           <w:sz w:val="17"/>
         </w:rPr>
-        <w:t xml:space="preserve">    auditoria/    [crítico] corrección con motivo e historial             US-04</w:t>
+        <w:t xml:space="preserve">                  [crítico] dimensiones por gestión: suman 100; bloqueadas  US-18 (T-015)</w:t>
       </w:r>
     </w:p>
     <w:p>
@@ -1012,7 +1012,61 @@
           <w:rFonts w:ascii="Consolas" w:hAnsi="Consolas" w:cs="Consolas" w:eastAsia="Consolas"/>
           <w:sz w:val="17"/>
         </w:rPr>
-        <w:t>api/test/        e2e con PostgreSQL real (autorizacion, notas, auditoria) y fixtures</w:t>
+        <w:t xml:space="preserve">                  si la gestión tiene notas (GET/PUT /api/gestiones/:id/dimensiones)</w:t>
+      </w:r>
+    </w:p>
+    <w:p>
+      <w:pPr>
+        <w:keepLines/>
+        <w:pBdr>
+          <w:left w:val="single" w:color="9DBBD8" w:sz="12" w:space="6"/>
+        </w:pBdr>
+        <w:shd w:fill="F2F2F2" w:color="auto" w:val="clear"/>
+        <w:spacing w:after="0" w:before="0" w:line="240"/>
+        <w:ind w:left="170" w:right="170"/>
+      </w:pPr>
+      <w:r>
+        <w:rPr>
+          <w:rFonts w:ascii="Consolas" w:hAnsi="Consolas" w:cs="Consolas" w:eastAsia="Consolas"/>
+          <w:sz w:val="17"/>
+        </w:rPr>
+        <w:t xml:space="preserve">    auditoria/    [crítico] corrección con motivo e historial             US-04</w:t>
+      </w:r>
+    </w:p>
+    <w:p>
+      <w:pPr>
+        <w:keepLines/>
+        <w:pBdr>
+          <w:left w:val="single" w:color="9DBBD8" w:sz="12" w:space="6"/>
+        </w:pBdr>
+        <w:shd w:fill="F2F2F2" w:color="auto" w:val="clear"/>
+        <w:spacing w:after="0" w:before="0" w:line="240"/>
+        <w:ind w:left="170" w:right="170"/>
+      </w:pPr>
+      <w:r>
+        <w:rPr>
+          <w:rFonts w:ascii="Consolas" w:hAnsi="Consolas" w:cs="Consolas" w:eastAsia="Consolas"/>
+          <w:sz w:val="17"/>
+        </w:rPr>
+        <w:t xml:space="preserve">    asistencia/   asistencia por clase y porcentaje por estudiante        US-19 (T-036)</w:t>
+      </w:r>
+    </w:p>
+    <w:p>
+      <w:pPr>
+        <w:keepLines/>
+        <w:pBdr>
+          <w:left w:val="single" w:color="9DBBD8" w:sz="12" w:space="6"/>
+        </w:pBdr>
+        <w:shd w:fill="F2F2F2" w:color="auto" w:val="clear"/>
+        <w:spacing w:after="0" w:before="0" w:line="240"/>
+        <w:ind w:left="170" w:right="170"/>
+      </w:pPr>
+      <w:r>
+        <w:rPr>
+          <w:rFonts w:ascii="Consolas" w:hAnsi="Consolas" w:cs="Consolas" w:eastAsia="Consolas"/>
+          <w:sz w:val="17"/>
+        </w:rPr>
+        <w:t>api/test/        e2e con PostgreSQL real (autorizacion, notas, auditoria, dimensiones, asistencia, esquema) y fixtures</w:t>
       </w:r>
     </w:p>
     <w:p>
@@ -2740,7 +2794,7 @@
               <w:rPr>
                 <w:sz w:val="19"/>
               </w:rPr>
-              <w:t>Render (API) + Vercel (web)</w:t>
+              <w:t>Render: API (Docker) y web (sitio estático), según render.yaml</w:t>
             </w:r>
           </w:p>
         </w:tc>
@@ -2974,7 +3028,7 @@
               <w:rPr>
                 <w:sz w:val="19"/>
               </w:rPr>
-              <w:t>Render + Vercel</w:t>
+              <w:t>Render (API y web)</w:t>
             </w:r>
           </w:p>
         </w:tc>
@@ -3023,17 +3077,16 @@
         <w:t>api/Dockerfile</w:t>
       </w:r>
       <w:r>
-        <w:t>) y aplica las migraciones al iniciar (</w:t>
+        <w:t>) y aplica las migraciones al iniciar (migration:run y después node dist/main.js; en staging, con SEMBRAR=1, carga el seed si la base está vacía)</w:t>
       </w:r>
       <w:r>
         <w:rPr>
           <w:rFonts w:ascii="Consolas" w:hAnsi="Consolas" w:cs="Consolas"/>
           <w:sz w:val="19"/>
         </w:rPr>
-        <w:t>npm run db:migrate &amp;&amp; node dist/main.js</w:t>
-      </w:r>
-      <w:r>
-        <w:t xml:space="preserve">). El commit desplegado se lee de </w:t>
+      </w:r>
+      <w:r>
+        <w:t xml:space="preserve">. El commit desplegado se lee de </w:t>
       </w:r>
       <w:r>
         <w:rPr>
@@ -4228,6 +4281,126 @@
                 <w:sz w:val="19"/>
               </w:rPr>
               <w:t>Versión inicial: arquitectura del repositorio base.</w:t>
+            </w:r>
+          </w:p>
+        </w:tc>
+        <w:tc>
+          <w:tcPr>
+            <w:tcW w:w="984" w:type="dxa"/>
+            <w:tcMar>
+              <w:top w:w="60" w:type="dxa"/>
+              <w:left w:w="100" w:type="dxa"/>
+              <w:bottom w:w="60" w:type="dxa"/>
+              <w:right w:w="100" w:type="dxa"/>
+            </w:tcMar>
+            <w:vAlign w:val="center"/>
+          </w:tcPr>
+          <w:p>
+            <w:pPr>
+              <w:spacing w:after="0" w:line="260" w:lineRule="auto"/>
+            </w:pPr>
+            <w:r>
+              <w:rPr>
+                <w:sz w:val="19"/>
+              </w:rPr>
+              <w:t>Lujan</w:t>
+            </w:r>
+          </w:p>
+        </w:tc>
+        <w:tc>
+          <w:tcPr>
+            <w:tcW w:w="1248" w:type="dxa"/>
+            <w:tcMar>
+              <w:top w:w="60" w:type="dxa"/>
+              <w:left w:w="100" w:type="dxa"/>
+              <w:bottom w:w="60" w:type="dxa"/>
+              <w:right w:w="100" w:type="dxa"/>
+            </w:tcMar>
+            <w:vAlign w:val="center"/>
+          </w:tcPr>
+          <w:p>
+            <w:pPr>
+              <w:spacing w:after="0" w:line="260" w:lineRule="auto"/>
+            </w:pPr>
+            <w:r>
+              <w:rPr>
+                <w:sz w:val="19"/>
+              </w:rPr>
+              <w:t>Galvan</w:t>
+            </w:r>
+          </w:p>
+        </w:tc>
+      </w:tr>
+      <w:tr>
+        <w:trPr>
+          <w:cantSplit/>
+        </w:trPr>
+        <w:tc>
+          <w:tcPr>
+            <w:tcW w:w="1246" w:type="dxa"/>
+            <w:tcMar>
+              <w:top w:w="60" w:type="dxa"/>
+              <w:left w:w="100" w:type="dxa"/>
+              <w:bottom w:w="60" w:type="dxa"/>
+              <w:right w:w="100" w:type="dxa"/>
+            </w:tcMar>
+            <w:vAlign w:val="center"/>
+          </w:tcPr>
+          <w:p>
+            <w:pPr>
+              <w:spacing w:after="0" w:line="260" w:lineRule="auto"/>
+            </w:pPr>
+            <w:r>
+              <w:rPr>
+                <w:sz w:val="19"/>
+              </w:rPr>
+              <w:t>1.1</w:t>
+            </w:r>
+          </w:p>
+        </w:tc>
+        <w:tc>
+          <w:tcPr>
+            <w:tcW w:w="1599" w:type="dxa"/>
+            <w:tcMar>
+              <w:top w:w="60" w:type="dxa"/>
+              <w:left w:w="100" w:type="dxa"/>
+              <w:bottom w:w="60" w:type="dxa"/>
+              <w:right w:w="100" w:type="dxa"/>
+            </w:tcMar>
+            <w:vAlign w:val="center"/>
+          </w:tcPr>
+          <w:p>
+            <w:pPr>
+              <w:spacing w:after="0" w:line="260" w:lineRule="auto"/>
+            </w:pPr>
+            <w:r>
+              <w:rPr>
+                <w:sz w:val="19"/>
+              </w:rPr>
+              <w:t>13/10/2026</w:t>
+            </w:r>
+          </w:p>
+        </w:tc>
+        <w:tc>
+          <w:tcPr>
+            <w:tcW w:w="5003" w:type="dxa"/>
+            <w:tcMar>
+              <w:top w:w="60" w:type="dxa"/>
+              <w:left w:w="100" w:type="dxa"/>
+              <w:bottom w:w="60" w:type="dxa"/>
+              <w:right w:w="100" w:type="dxa"/>
+            </w:tcMar>
+            <w:vAlign w:val="center"/>
+          </w:tcPr>
+          <w:p>
+            <w:pPr>
+              <w:spacing w:after="0" w:line="260" w:lineRule="auto"/>
+            </w:pPr>
+            <w:r>
+              <w:rPr>
+                <w:sz w:val="19"/>
+              </w:rPr>
+              <w:t>La web se despliega en Render y no en Vercel (ADR-0009); módulos de dimensiones por gestión (T-015) y de asistencia (T-036); arranque con migraciones y seed de staging.</w:t>
             </w:r>
           </w:p>
         </w:tc>

</xml_diff>

<commit_message>
docs(docs): SAD con la estructura de la web y tareas de frontend en revisión
SAD 1.2 (Markdown, Word y PDF): web/src por rol, componentes, sesión,
institución y tema. Backlog: T-012, T-013, T-017, T-020, T-021 y T-024
pasan a "En revisión" (las revisa Galvan).

Refs: T-012, T-013, T-017, T-020, T-021, T-024
</commit_message>
<xml_diff>
--- a/docs/sad/SAD-CalisFacu.docx
+++ b/docs/sad/SAD-CalisFacu.docx
@@ -1157,7 +1157,43 @@
           <w:rFonts w:ascii="Consolas" w:hAnsi="Consolas" w:cs="Consolas" w:eastAsia="Consolas"/>
           <w:sz w:val="17"/>
         </w:rPr>
-        <w:t>web/src/         App, pages/, lib/ (cliente de la API y validación)</w:t>
+        <w:t>web/src/         App (rutas por rol), componentes/ (marco, diálogos, estados de carga),</w:t>
+      </w:r>
+    </w:p>
+    <w:p>
+      <w:pPr>
+        <w:keepLines/>
+        <w:pBdr>
+          <w:left w:val="single" w:color="9DBBD8" w:sz="12" w:space="6"/>
+        </w:pBdr>
+        <w:shd w:fill="F2F2F2" w:color="auto" w:val="clear"/>
+        <w:spacing w:after="0" w:before="0" w:line="240"/>
+        <w:ind w:left="170" w:right="170"/>
+      </w:pPr>
+      <w:r>
+        <w:rPr>
+          <w:rFonts w:ascii="Consolas" w:hAnsi="Consolas" w:cs="Consolas" w:eastAsia="Consolas"/>
+          <w:sz w:val="17"/>
+        </w:rPr>
+        <w:t xml:space="preserve">                 pages/{profesor,secretaria,admin,padre}, lib/ (cliente de la API, sesión, institución),</w:t>
+      </w:r>
+    </w:p>
+    <w:p>
+      <w:pPr>
+        <w:keepLines/>
+        <w:pBdr>
+          <w:left w:val="single" w:color="9DBBD8" w:sz="12" w:space="6"/>
+        </w:pBdr>
+        <w:shd w:fill="F2F2F2" w:color="auto" w:val="clear"/>
+        <w:spacing w:after="0" w:before="0" w:line="240"/>
+        <w:ind w:left="170" w:right="170"/>
+      </w:pPr>
+      <w:r>
+        <w:rPr>
+          <w:rFonts w:ascii="Consolas" w:hAnsi="Consolas" w:cs="Consolas" w:eastAsia="Consolas"/>
+          <w:sz w:val="17"/>
+        </w:rPr>
+        <w:t xml:space="preserve">                 estilos/tema.css (tokens; colores de la institución desde la API, ADR-0010)</w:t>
       </w:r>
     </w:p>
     <w:p>
@@ -4992,7 +5028,7 @@
               <w:rPr>
                 <w:sz w:val="19"/>
               </w:rPr>
-              <w:t>Módulo académico (T-016): cursos, estudiantes con código RUDE (D10), materias, unidad educativa y su apariencia (ADR-0010); renovación de la sesión (D11).</w:t>
+              <w:t>Módulo académico (T-016): cursos, estudiantes con código RUDE (D10), materias, unidad educativa y su apariencia (ADR-0010); renovación de la sesión (D11); web con las pantallas de cada rol, para escritorio y celular.</w:t>
             </w:r>
           </w:p>
         </w:tc>

</xml_diff>